<commit_message>
ep24: Opus verification fixes for 画龙点睛
- Fix pinyin: 一语中的 zhōng→zhòng (4th tone), 信息 xìnxi→xìnxī, 添加 tiānjia→tiānjiā
- Add 锦上添花 introductory line in synonyms section (was introduced without context)

Co-Authored-By: Claude Sonnet 4.6 <noreply@anthropic.com>
</commit_message>
<xml_diff>
--- a/scripts/20260519_hua-long-dian-jing/20260519_hua-long-dian-jing_script.docx
+++ b/scripts/20260519_hua-long-dian-jing/20260519_hua-long-dian-jing_script.docx
@@ -1519,7 +1519,7 @@
           <w:color w:val="555555"/>
           <w:sz w:val="20"/>
         </w:rPr>
-        <w:t>jìnyìcí yǒu: diǎn shí chéng jīn, yī yǔ zhōng dì.</w:t>
+        <w:t>jìnyìcí yǒu: diǎn shí chéng jīn, yī yǔ zhòng dì.</w:t>
       </w:r>
     </w:p>
     <w:p>
@@ -1558,7 +1558,7 @@
         <w:rPr>
           <w:sz w:val="22"/>
         </w:rPr>
-        <w:t>但要注意，画龙点睛强调那一笔的决定性；而锦上添花更侧重'在已经好的基础上再加分'。</w:t>
+        <w:t>另外，还有一个常被拿来比较的成语——锦上添花。但要注意，画龙点睛强调那一笔的决定性；而锦上添花更侧重'在已经好的基础上再加分'。</w:t>
       </w:r>
     </w:p>
     <w:p>
@@ -1579,7 +1579,7 @@
           <w:color w:val="555555"/>
           <w:sz w:val="20"/>
         </w:rPr>
-        <w:t>dàn yào zhùyì, huà lóng diǎn jīng qiángdiào nà yī bǐ de juédìngxìng; ér jǐn shàng tiān huā gèng cèzhòng 'zài yǐjīng hǎo de jīchǔ shàng zài jiā fēn'.</w:t>
+        <w:t>lìngwài, hái yǒu yī gè cháng bèi ná lái bǐjiào de chéngyǔ——jǐn shàng tiān huā. Dàn yào zhùyì, huà lóng diǎn jīng qiángdiào nà yī bǐ de juédìngxìng; ér jǐn shàng tiān huā gèng cèzhòng 'zài yǐjīng hǎo de jīchǔ shàng zài jiā fēn'.</w:t>
       </w:r>
     </w:p>
     <w:p>
@@ -1599,7 +1599,7 @@
           <w:color w:val="555555"/>
           <w:sz w:val="20"/>
         </w:rPr>
-        <w:t>But note: 画龙点睛 emphasizes the decisive, transformative nature of that one touch; while 锦上添花 focuses more on 'adding more to something already good.'</w:t>
+        <w:t>There is also a related idiom often compared with it — 锦上添花. But note: 画龙点睛 emphasizes the decisive, transformative nature of that one touch, while 锦上添花 focuses more on 'adding more to something already good.'</w:t>
       </w:r>
     </w:p>
     <w:p>
@@ -2821,7 +2821,7 @@
           <w:color w:val="555555"/>
           <w:sz w:val="20"/>
         </w:rPr>
-        <w:t>zhùyì: rúguǒ tiānjia de fǎnér shì duōyú de, nà jiù bú shì huà lóng diǎn jīng, ér shì 'huà shé tiān zú' le!</w:t>
+        <w:t>zhùyì: rúguǒ tiānjiā de fǎnér shì duōyú de, nà jiù bú shì huà lóng diǎn jīng, ér shì 'huà shé tiān zú' le!</w:t>
       </w:r>
     </w:p>
     <w:p>
@@ -2894,7 +2894,7 @@
           <w:color w:val="555555"/>
           <w:sz w:val="20"/>
         </w:rPr>
-        <w:t>xià cì nǐ zài xiě wénzhāng, fā xìnxi, huòzhě zhǔnbèi fāyán de shíhou, bùfáng duō xiǎng yī xiǎng: yǒu méiyǒu yī jù huà, kěyǐ chéngwéi nǐ de huà lóng diǎn jīng zhī bǐ?</w:t>
+        <w:t>xià cì nǐ zài xiě wénzhāng, fā xìnxī, huòzhě zhǔnbèi fāyán de shíhou, bùfáng duō xiǎng yī xiǎng: yǒu méiyǒu yī jù huà, kěyǐ chéngwéi nǐ de huà lóng diǎn jīng zhī bǐ?</w:t>
       </w:r>
     </w:p>
     <w:p>

</xml_diff>